<commit_message>
vault backup: 2025-03-11 11:36:46
</commit_message>
<xml_diff>
--- a/Lec HW/MSP430_class1.docx
+++ b/Lec HW/MSP430_class1.docx
@@ -6,21 +6,27 @@
       <w:pPr>
         <w:pStyle w:val="a3"/>
         <w:rPr>
-          <w:rFonts w:ascii="Times New Roman" w:eastAsia="標楷體" w:hAnsi="Times New Roman" w:cs="Times New Roman"/>
+          <w:rFonts w:ascii="Times New Roman" w:eastAsia="標楷體" w:hAnsi="Times New Roman" w:cs="Times New Roman" w:hint="eastAsia"/>
         </w:rPr>
       </w:pPr>
       <w:r>
         <w:rPr>
           <w:rFonts w:ascii="Times New Roman" w:eastAsia="標楷體" w:hAnsi="Times New Roman" w:cs="Times New Roman"/>
         </w:rPr>
-        <w:t>Homework2</w:t>
+        <w:t>Homework</w:t>
+      </w:r>
+      <w:r>
+        <w:rPr>
+          <w:rFonts w:ascii="Times New Roman" w:eastAsia="標楷體" w:hAnsi="Times New Roman" w:cs="Times New Roman" w:hint="eastAsia"/>
+        </w:rPr>
+        <w:t>3</w:t>
       </w:r>
     </w:p>
     <w:p>
       <w:pPr>
         <w:ind w:left="360" w:hanging="360"/>
         <w:rPr>
-          <w:rFonts w:ascii="Times New Roman" w:eastAsia="標楷體" w:hAnsi="Times New Roman" w:cs="Times New Roman" w:hint="eastAsia"/>
+          <w:rFonts w:ascii="Times New Roman" w:eastAsia="標楷體" w:hAnsi="Times New Roman" w:cs="Times New Roman"/>
         </w:rPr>
       </w:pPr>
       <w:r>
@@ -38,114 +44,21 @@
           <w:numId w:val="1"/>
         </w:numPr>
         <w:rPr>
-          <w:rFonts w:ascii="Times New Roman" w:eastAsia="標楷體" w:hAnsi="Times New Roman" w:cs="Times New Roman"/>
+          <w:rFonts w:ascii="Times New Roman" w:eastAsia="標楷體" w:hAnsi="Times New Roman" w:cs="Times New Roman" w:hint="eastAsia"/>
         </w:rPr>
       </w:pPr>
       <w:r>
         <w:rPr>
           <w:rFonts w:ascii="Times New Roman" w:eastAsia="標楷體" w:hAnsi="Times New Roman" w:cs="Times New Roman"/>
         </w:rPr>
-        <w:t>P</w:t>
+        <w:t>Pinout</w:t>
       </w:r>
       <w:r>
         <w:rPr>
           <w:rFonts w:ascii="Times New Roman" w:eastAsia="標楷體" w:hAnsi="Times New Roman" w:cs="Times New Roman"/>
         </w:rPr>
-        <w:t>in</w:t>
-      </w:r>
-      <w:r>
-        <w:rPr>
-          <w:rFonts w:ascii="Times New Roman" w:eastAsia="標楷體" w:hAnsi="Times New Roman" w:cs="Times New Roman"/>
-        </w:rPr>
-        <w:t>out</w:t>
-      </w:r>
-      <w:r>
-        <w:rPr>
-          <w:rFonts w:ascii="Times New Roman" w:eastAsia="標楷體" w:hAnsi="Times New Roman" w:cs="Times New Roman"/>
-        </w:rPr>
         <w:t>接線</w:t>
       </w:r>
-      <w:r>
-        <w:rPr>
-          <w:rFonts w:ascii="Times New Roman" w:eastAsia="標楷體" w:hAnsi="Times New Roman" w:cs="Times New Roman" w:hint="eastAsia"/>
-        </w:rPr>
-        <w:t>，舉例</w:t>
-      </w:r>
-      <w:r>
-        <w:rPr>
-          <w:rFonts w:ascii="Times New Roman" w:eastAsia="標楷體" w:hAnsi="Times New Roman" w:cs="Times New Roman"/>
-        </w:rPr>
-        <w:t>：</w:t>
-      </w:r>
-    </w:p>
-    <w:p>
-      <w:pPr>
-        <w:jc w:val="center"/>
-        <w:rPr>
-          <w:rFonts w:ascii="Times New Roman" w:eastAsia="標楷體" w:hAnsi="Times New Roman" w:cs="Times New Roman"/>
-        </w:rPr>
-      </w:pPr>
-      <w:r>
-        <w:rPr>
-          <w:rFonts w:ascii="Times New Roman" w:eastAsia="標楷體" w:hAnsi="Times New Roman" w:cs="Times New Roman"/>
-          <w:noProof/>
-        </w:rPr>
-        <w:drawing>
-          <wp:inline distT="0" distB="0" distL="0" distR="0" wp14:anchorId="5C384BA3" wp14:editId="76BA9D47">
-            <wp:extent cx="3331598" cy="1955800"/>
-            <wp:effectExtent l="0" t="0" r="2540" b="6350"/>
-            <wp:docPr id="1749031406" name="圖片 1" descr="How to connect a J-Link debug probe to the STEVAL-... - STMicroelectronics  Community"/>
-            <wp:cNvGraphicFramePr>
-              <a:graphicFrameLocks xmlns:a="http://schemas.openxmlformats.org/drawingml/2006/main" noChangeAspect="1"/>
-            </wp:cNvGraphicFramePr>
-            <a:graphic xmlns:a="http://schemas.openxmlformats.org/drawingml/2006/main">
-              <a:graphicData uri="http://schemas.openxmlformats.org/drawingml/2006/picture">
-                <pic:pic xmlns:pic="http://schemas.openxmlformats.org/drawingml/2006/picture">
-                  <pic:nvPicPr>
-                    <pic:cNvPr id="0" name="Picture 1" descr="How to connect a J-Link debug probe to the STEVAL-... - STMicroelectronics  Community"/>
-                    <pic:cNvPicPr>
-                      <a:picLocks noChangeAspect="1" noChangeArrowheads="1"/>
-                    </pic:cNvPicPr>
-                  </pic:nvPicPr>
-                  <pic:blipFill>
-                    <a:blip r:embed="rId5" cstate="print">
-                      <a:extLst>
-                        <a:ext uri="{28A0092B-C50C-407E-A947-70E740481C1C}">
-                          <a14:useLocalDpi xmlns:a14="http://schemas.microsoft.com/office/drawing/2010/main" val="0"/>
-                        </a:ext>
-                      </a:extLst>
-                    </a:blip>
-                    <a:srcRect/>
-                    <a:stretch>
-                      <a:fillRect/>
-                    </a:stretch>
-                  </pic:blipFill>
-                  <pic:spPr bwMode="auto">
-                    <a:xfrm>
-                      <a:off x="0" y="0"/>
-                      <a:ext cx="3336860" cy="1958889"/>
-                    </a:xfrm>
-                    <a:prstGeom prst="rect">
-                      <a:avLst/>
-                    </a:prstGeom>
-                    <a:noFill/>
-                    <a:ln>
-                      <a:noFill/>
-                    </a:ln>
-                  </pic:spPr>
-                </pic:pic>
-              </a:graphicData>
-            </a:graphic>
-          </wp:inline>
-        </w:drawing>
-      </w:r>
-    </w:p>
-    <w:p>
-      <w:pPr>
-        <w:rPr>
-          <w:rFonts w:ascii="Times New Roman" w:eastAsia="標楷體" w:hAnsi="Times New Roman" w:cs="Times New Roman"/>
-        </w:rPr>
-      </w:pPr>
     </w:p>
     <w:p>
       <w:pPr>
@@ -170,74 +83,6 @@
         </w:rPr>
         <w:t>Block diagram</w:t>
       </w:r>
-      <w:r>
-        <w:rPr>
-          <w:rFonts w:ascii="Times New Roman" w:eastAsia="標楷體" w:hAnsi="Times New Roman" w:cs="Times New Roman" w:hint="eastAsia"/>
-        </w:rPr>
-        <w:t>，舉例：</w:t>
-      </w:r>
-    </w:p>
-    <w:p>
-      <w:pPr>
-        <w:jc w:val="center"/>
-        <w:rPr>
-          <w:rFonts w:ascii="Times New Roman" w:eastAsia="標楷體" w:hAnsi="Times New Roman" w:cs="Times New Roman"/>
-        </w:rPr>
-      </w:pPr>
-      <w:r>
-        <w:rPr>
-          <w:rFonts w:ascii="Times New Roman" w:eastAsia="標楷體" w:hAnsi="Times New Roman" w:cs="Times New Roman"/>
-          <w:noProof/>
-        </w:rPr>
-        <w:drawing>
-          <wp:inline distT="0" distB="0" distL="0" distR="0" wp14:anchorId="6FF43B30" wp14:editId="078FA464">
-            <wp:extent cx="3512238" cy="2247900"/>
-            <wp:effectExtent l="0" t="0" r="0" b="0"/>
-            <wp:docPr id="1035800986" name="圖片 2" descr="Block Diagram Of Computer Hardware"/>
-            <wp:cNvGraphicFramePr>
-              <a:graphicFrameLocks xmlns:a="http://schemas.openxmlformats.org/drawingml/2006/main" noChangeAspect="1"/>
-            </wp:cNvGraphicFramePr>
-            <a:graphic xmlns:a="http://schemas.openxmlformats.org/drawingml/2006/main">
-              <a:graphicData uri="http://schemas.openxmlformats.org/drawingml/2006/picture">
-                <pic:pic xmlns:pic="http://schemas.openxmlformats.org/drawingml/2006/picture">
-                  <pic:nvPicPr>
-                    <pic:cNvPr id="0" name="Picture 3" descr="Block Diagram Of Computer Hardware"/>
-                    <pic:cNvPicPr>
-                      <a:picLocks noChangeAspect="1" noChangeArrowheads="1"/>
-                    </pic:cNvPicPr>
-                  </pic:nvPicPr>
-                  <pic:blipFill>
-                    <a:blip r:embed="rId6" cstate="print">
-                      <a:extLst>
-                        <a:ext uri="{28A0092B-C50C-407E-A947-70E740481C1C}">
-                          <a14:useLocalDpi xmlns:a14="http://schemas.microsoft.com/office/drawing/2010/main" val="0"/>
-                        </a:ext>
-                      </a:extLst>
-                    </a:blip>
-                    <a:srcRect/>
-                    <a:stretch>
-                      <a:fillRect/>
-                    </a:stretch>
-                  </pic:blipFill>
-                  <pic:spPr bwMode="auto">
-                    <a:xfrm>
-                      <a:off x="0" y="0"/>
-                      <a:ext cx="3515465" cy="2249965"/>
-                    </a:xfrm>
-                    <a:prstGeom prst="rect">
-                      <a:avLst/>
-                    </a:prstGeom>
-                    <a:noFill/>
-                    <a:ln>
-                      <a:noFill/>
-                    </a:ln>
-                  </pic:spPr>
-                </pic:pic>
-              </a:graphicData>
-            </a:graphic>
-          </wp:inline>
-        </w:drawing>
-      </w:r>
     </w:p>
     <w:p>
       <w:pPr>
@@ -280,12 +125,6 @@
         </w:rPr>
         <w:t>上</w:t>
       </w:r>
-      <w:r>
-        <w:rPr>
-          <w:rFonts w:ascii="Times New Roman" w:eastAsia="標楷體" w:hAnsi="Times New Roman" w:cs="Times New Roman"/>
-        </w:rPr>
-        <w:t xml:space="preserve"> </w:t>
-      </w:r>
     </w:p>
     <w:p>
       <w:pPr>
@@ -302,31 +141,19 @@
         <w:rPr>
           <w:rFonts w:ascii="Times New Roman" w:eastAsia="標楷體" w:hAnsi="Times New Roman" w:cs="Times New Roman" w:hint="eastAsia"/>
         </w:rPr>
-        <w:t>確認是否完成影片中的內容</w:t>
+        <w:t>附上講義表格</w:t>
       </w:r>
       <w:r>
         <w:rPr>
           <w:rFonts w:ascii="Times New Roman" w:eastAsia="標楷體" w:hAnsi="Times New Roman" w:cs="Times New Roman" w:hint="eastAsia"/>
         </w:rPr>
-        <w:t>(</w:t>
-      </w:r>
-      <w:r>
-        <w:rPr>
-          <w:rFonts w:ascii="Times New Roman" w:eastAsia="標楷體" w:hAnsi="Times New Roman" w:cs="Times New Roman" w:hint="eastAsia"/>
-        </w:rPr>
-        <w:t>基本上是實驗課的簡化版</w:t>
-      </w:r>
-      <w:r>
-        <w:rPr>
-          <w:rFonts w:ascii="Times New Roman" w:eastAsia="標楷體" w:hAnsi="Times New Roman" w:cs="Times New Roman" w:hint="eastAsia"/>
-        </w:rPr>
-        <w:t>)</w:t>
+        <w:t>1~3</w:t>
       </w:r>
     </w:p>
     <w:p>
       <w:pPr>
         <w:rPr>
-          <w:rFonts w:ascii="Times New Roman" w:eastAsia="標楷體" w:hAnsi="Times New Roman" w:cs="Times New Roman" w:hint="eastAsia"/>
+          <w:rFonts w:ascii="Times New Roman" w:eastAsia="標楷體" w:hAnsi="Times New Roman" w:cs="Times New Roman"/>
         </w:rPr>
       </w:pPr>
     </w:p>
@@ -346,325 +173,17 @@
     </w:p>
     <w:p>
       <w:pPr>
-        <w:pStyle w:val="a9"/>
-        <w:numPr>
-          <w:ilvl w:val="0"/>
-          <w:numId w:val="2"/>
-        </w:numPr>
         <w:jc w:val="both"/>
         <w:rPr>
           <w:rFonts w:ascii="Times New Roman" w:eastAsia="標楷體" w:hAnsi="Times New Roman" w:cs="Times New Roman"/>
         </w:rPr>
       </w:pPr>
-      <w:r>
-        <w:rPr>
-          <w:rFonts w:ascii="Times New Roman" w:eastAsia="標楷體" w:hAnsi="Times New Roman" w:cs="Times New Roman"/>
-        </w:rPr>
-        <w:t>無法</w:t>
-      </w:r>
-      <w:r>
-        <w:rPr>
-          <w:rFonts w:ascii="Times New Roman" w:eastAsia="標楷體" w:hAnsi="Times New Roman" w:cs="Times New Roman" w:hint="eastAsia"/>
-        </w:rPr>
-        <w:t>將</w:t>
-      </w:r>
-      <w:r>
-        <w:rPr>
-          <w:rFonts w:ascii="Times New Roman" w:eastAsia="標楷體" w:hAnsi="Times New Roman" w:cs="Times New Roman"/>
-        </w:rPr>
-        <w:t>USB application</w:t>
-      </w:r>
-      <w:r>
-        <w:rPr>
-          <w:rFonts w:ascii="Times New Roman" w:eastAsia="標楷體" w:hAnsi="Times New Roman" w:cs="Times New Roman"/>
-        </w:rPr>
-        <w:t>的</w:t>
-      </w:r>
-      <w:r>
-        <w:rPr>
-          <w:rFonts w:ascii="Times New Roman" w:eastAsia="標楷體" w:hAnsi="Times New Roman" w:cs="Times New Roman" w:hint="eastAsia"/>
-        </w:rPr>
-        <w:t>UART</w:t>
-      </w:r>
-      <w:r>
-        <w:rPr>
-          <w:rFonts w:ascii="Times New Roman" w:eastAsia="標楷體" w:hAnsi="Times New Roman" w:cs="Times New Roman" w:hint="eastAsia"/>
-        </w:rPr>
-        <w:t>輸出到</w:t>
-      </w:r>
-      <w:r>
-        <w:rPr>
-          <w:rFonts w:ascii="Times New Roman" w:eastAsia="標楷體" w:hAnsi="Times New Roman" w:cs="Times New Roman" w:hint="eastAsia"/>
-        </w:rPr>
-        <w:t>Serial Monitor</w:t>
-      </w:r>
-      <w:r>
-        <w:rPr>
-          <w:rFonts w:ascii="Times New Roman" w:eastAsia="標楷體" w:hAnsi="Times New Roman" w:cs="Times New Roman" w:hint="eastAsia"/>
-        </w:rPr>
-        <w:t>中</w:t>
-      </w:r>
-      <w:r>
-        <w:rPr>
-          <w:rFonts w:ascii="Times New Roman" w:eastAsia="標楷體" w:hAnsi="Times New Roman" w:cs="Times New Roman" w:hint="eastAsia"/>
-        </w:rPr>
-        <w:t>?</w:t>
-      </w:r>
     </w:p>
     <w:p>
       <w:pPr>
-        <w:pStyle w:val="a9"/>
-        <w:ind w:left="360"/>
-        <w:jc w:val="both"/>
-        <w:rPr>
-          <w:rFonts w:ascii="Times New Roman" w:eastAsia="標楷體" w:hAnsi="Times New Roman" w:cs="Times New Roman" w:hint="eastAsia"/>
-        </w:rPr>
-      </w:pPr>
-      <w:r>
-        <w:rPr>
-          <w:rFonts w:ascii="Times New Roman" w:eastAsia="標楷體" w:hAnsi="Times New Roman" w:cs="Times New Roman"/>
-        </w:rPr>
-        <w:t>要</w:t>
-      </w:r>
-      <w:r>
-        <w:rPr>
-          <w:rFonts w:ascii="Times New Roman" w:eastAsia="標楷體" w:hAnsi="Times New Roman" w:cs="Times New Roman" w:hint="eastAsia"/>
-        </w:rPr>
-        <w:t>透過</w:t>
-      </w:r>
-      <w:r>
-        <w:rPr>
-          <w:rFonts w:ascii="Times New Roman" w:eastAsia="標楷體" w:hAnsi="Times New Roman" w:cs="Times New Roman" w:hint="eastAsia"/>
-        </w:rPr>
-        <w:t>Jumper</w:t>
-      </w:r>
-      <w:r>
-        <w:rPr>
-          <w:rFonts w:ascii="Times New Roman" w:eastAsia="標楷體" w:hAnsi="Times New Roman" w:cs="Times New Roman"/>
-        </w:rPr>
-        <w:t>先</w:t>
-      </w:r>
-      <w:r>
-        <w:rPr>
-          <w:rFonts w:ascii="Times New Roman" w:eastAsia="標楷體" w:hAnsi="Times New Roman" w:cs="Times New Roman" w:hint="eastAsia"/>
-        </w:rPr>
-        <w:t>將</w:t>
-      </w:r>
-      <w:r>
-        <w:rPr>
-          <w:rFonts w:ascii="Times New Roman" w:eastAsia="標楷體" w:hAnsi="Times New Roman" w:cs="Times New Roman"/>
-        </w:rPr>
-        <w:t>設定為</w:t>
-      </w:r>
-      <w:r>
-        <w:rPr>
-          <w:rFonts w:ascii="Times New Roman" w:eastAsia="標楷體" w:hAnsi="Times New Roman" w:cs="Times New Roman"/>
-        </w:rPr>
-        <w:t>Hardware_UART</w:t>
-      </w:r>
-      <w:r>
-        <w:rPr>
-          <w:rFonts w:ascii="Times New Roman" w:eastAsia="標楷體" w:hAnsi="Times New Roman" w:cs="Times New Roman" w:hint="eastAsia"/>
-        </w:rPr>
-        <w:t xml:space="preserve"> (</w:t>
-      </w:r>
-      <w:r>
-        <w:rPr>
-          <w:rFonts w:ascii="Times New Roman" w:eastAsia="標楷體" w:hAnsi="Times New Roman" w:cs="Times New Roman" w:hint="eastAsia"/>
-        </w:rPr>
-        <w:t>詳細可以參考</w:t>
-      </w:r>
-      <w:r>
-        <w:rPr>
-          <w:rFonts w:ascii="Times New Roman" w:eastAsia="標楷體" w:hAnsi="Times New Roman" w:cs="Times New Roman" w:hint="eastAsia"/>
-        </w:rPr>
-        <w:t>[1</w:t>
-      </w:r>
-      <w:r>
-        <w:rPr>
-          <w:rFonts w:ascii="Times New Roman" w:eastAsia="標楷體" w:hAnsi="Times New Roman" w:cs="Times New Roman" w:hint="eastAsia"/>
-        </w:rPr>
-        <w:t>-3</w:t>
-      </w:r>
-      <w:r>
-        <w:rPr>
-          <w:rFonts w:ascii="Times New Roman" w:eastAsia="標楷體" w:hAnsi="Times New Roman" w:cs="Times New Roman" w:hint="eastAsia"/>
-        </w:rPr>
-        <w:t>])</w:t>
-      </w:r>
-    </w:p>
-    <w:p>
-      <w:pPr>
-        <w:pStyle w:val="a9"/>
-        <w:numPr>
-          <w:ilvl w:val="0"/>
-          <w:numId w:val="2"/>
-        </w:numPr>
-        <w:jc w:val="both"/>
-        <w:rPr>
-          <w:rFonts w:ascii="Times New Roman" w:eastAsia="標楷體" w:hAnsi="Times New Roman" w:cs="Times New Roman"/>
-        </w:rPr>
-      </w:pPr>
-      <w:r>
-        <w:rPr>
-          <w:rFonts w:ascii="Times New Roman" w:eastAsia="標楷體" w:hAnsi="Times New Roman" w:cs="Times New Roman"/>
-        </w:rPr>
-        <w:t>出現燒錄的</w:t>
-      </w:r>
-      <w:r>
-        <w:rPr>
-          <w:rFonts w:ascii="Times New Roman" w:eastAsia="標楷體" w:hAnsi="Times New Roman" w:cs="Times New Roman"/>
-        </w:rPr>
-        <w:t>Driver</w:t>
-      </w:r>
-      <w:r>
-        <w:rPr>
-          <w:rFonts w:ascii="Times New Roman" w:eastAsia="標楷體" w:hAnsi="Times New Roman" w:cs="Times New Roman"/>
-        </w:rPr>
-        <w:t>問題：</w:t>
-      </w:r>
-      <w:r>
-        <w:rPr>
-          <w:rFonts w:ascii="Times New Roman" w:eastAsia="標楷體" w:hAnsi="Times New Roman" w:cs="Times New Roman" w:hint="eastAsia"/>
-        </w:rPr>
-        <w:t>(Mac</w:t>
-      </w:r>
-      <w:r>
-        <w:rPr>
-          <w:rFonts w:ascii="Times New Roman" w:eastAsia="標楷體" w:hAnsi="Times New Roman" w:cs="Times New Roman" w:hint="eastAsia"/>
-        </w:rPr>
-        <w:t>用戶請直接跳至乙選項</w:t>
-      </w:r>
-      <w:r>
-        <w:rPr>
-          <w:rFonts w:ascii="Times New Roman" w:eastAsia="標楷體" w:hAnsi="Times New Roman" w:cs="Times New Roman" w:hint="eastAsia"/>
-        </w:rPr>
-        <w:t>)</w:t>
-      </w:r>
-    </w:p>
-    <w:p>
-      <w:pPr>
-        <w:pStyle w:val="a9"/>
-        <w:numPr>
-          <w:ilvl w:val="1"/>
-          <w:numId w:val="2"/>
-        </w:numPr>
-        <w:jc w:val="both"/>
-        <w:rPr>
-          <w:rFonts w:ascii="Times New Roman" w:eastAsia="標楷體" w:hAnsi="Times New Roman" w:cs="Times New Roman"/>
-        </w:rPr>
-      </w:pPr>
-      <w:r>
-        <w:rPr>
-          <w:rFonts w:ascii="Times New Roman" w:eastAsia="標楷體" w:hAnsi="Times New Roman" w:cs="Times New Roman"/>
-        </w:rPr>
-        <w:lastRenderedPageBreak/>
-        <w:t>嘗試重新下載官方提供的</w:t>
-      </w:r>
-      <w:r>
-        <w:rPr>
-          <w:rFonts w:ascii="Times New Roman" w:eastAsia="標楷體" w:hAnsi="Times New Roman" w:cs="Times New Roman"/>
-        </w:rPr>
-        <w:t>driver</w:t>
-      </w:r>
-      <w:r>
-        <w:rPr>
-          <w:rFonts w:ascii="Times New Roman" w:eastAsia="標楷體" w:hAnsi="Times New Roman" w:cs="Times New Roman"/>
-        </w:rPr>
-        <w:t>修復</w:t>
-      </w:r>
-      <w:r>
-        <w:rPr>
-          <w:rFonts w:ascii="Times New Roman" w:eastAsia="標楷體" w:hAnsi="Times New Roman" w:cs="Times New Roman" w:hint="eastAsia"/>
-        </w:rPr>
-        <w:t xml:space="preserve"> [4]</w:t>
-      </w:r>
-    </w:p>
-    <w:p>
-      <w:pPr>
-        <w:pStyle w:val="a9"/>
-        <w:numPr>
-          <w:ilvl w:val="1"/>
-          <w:numId w:val="2"/>
-        </w:numPr>
-        <w:rPr>
-          <w:rFonts w:ascii="Times New Roman" w:eastAsia="標楷體" w:hAnsi="Times New Roman" w:cs="Times New Roman"/>
-        </w:rPr>
-      </w:pPr>
-      <w:r>
-        <w:rPr>
-          <w:rFonts w:ascii="Times New Roman" w:eastAsia="標楷體" w:hAnsi="Times New Roman" w:cs="Times New Roman"/>
-        </w:rPr>
-        <w:t>嘗試先用</w:t>
-      </w:r>
-      <w:r>
-        <w:rPr>
-          <w:rFonts w:ascii="Times New Roman" w:eastAsia="標楷體" w:hAnsi="Times New Roman" w:cs="Times New Roman"/>
-        </w:rPr>
-        <w:t>CCS</w:t>
-      </w:r>
-      <w:r>
-        <w:rPr>
-          <w:rFonts w:ascii="Times New Roman" w:eastAsia="標楷體" w:hAnsi="Times New Roman" w:cs="Times New Roman"/>
-        </w:rPr>
-        <w:t>燒錄過一次，然後跳過</w:t>
-      </w:r>
-      <w:r>
-        <w:rPr>
-          <w:rFonts w:ascii="Times New Roman" w:eastAsia="標楷體" w:hAnsi="Times New Roman" w:cs="Times New Roman"/>
-        </w:rPr>
-        <w:t>Energia</w:t>
-      </w:r>
-      <w:r>
-        <w:rPr>
-          <w:rFonts w:ascii="Times New Roman" w:eastAsia="標楷體" w:hAnsi="Times New Roman" w:cs="Times New Roman"/>
-        </w:rPr>
-        <w:t>使用</w:t>
-      </w:r>
-      <w:r>
-        <w:rPr>
-          <w:rFonts w:ascii="Times New Roman" w:eastAsia="標楷體" w:hAnsi="Times New Roman" w:cs="Times New Roman"/>
-        </w:rPr>
-        <w:t xml:space="preserve">PlatformIO </w:t>
-      </w:r>
-      <w:r>
-        <w:rPr>
-          <w:rFonts w:ascii="Times New Roman" w:eastAsia="標楷體" w:hAnsi="Times New Roman" w:cs="Times New Roman"/>
-        </w:rPr>
-        <w:t>的編譯環境</w:t>
-      </w:r>
-      <w:r>
-        <w:rPr>
-          <w:rFonts w:ascii="Times New Roman" w:eastAsia="標楷體" w:hAnsi="Times New Roman" w:cs="Times New Roman" w:hint="eastAsia"/>
-        </w:rPr>
-        <w:t xml:space="preserve"> [5]</w:t>
-      </w:r>
-      <w:r>
-        <w:rPr>
-          <w:rFonts w:ascii="Times New Roman" w:eastAsia="標楷體" w:hAnsi="Times New Roman" w:cs="Times New Roman" w:hint="eastAsia"/>
-        </w:rPr>
-        <w:t>，並可以通過以下指令開啟</w:t>
-      </w:r>
-      <w:r>
-        <w:rPr>
-          <w:rFonts w:ascii="Times New Roman" w:eastAsia="標楷體" w:hAnsi="Times New Roman" w:cs="Times New Roman" w:hint="eastAsia"/>
-        </w:rPr>
-        <w:t>Serial Monitor[6]</w:t>
-      </w:r>
-    </w:p>
-    <w:p>
-      <w:pPr>
-        <w:jc w:val="both"/>
-        <w:rPr>
-          <w:rFonts w:ascii="Times New Roman" w:eastAsia="標楷體" w:hAnsi="Times New Roman" w:cs="Times New Roman"/>
-        </w:rPr>
-      </w:pPr>
-    </w:p>
-    <w:p>
-      <w:pPr>
         <w:pStyle w:val="a3"/>
         <w:rPr>
-          <w:rFonts w:ascii="標楷體" w:eastAsia="標楷體" w:hAnsi="標楷體"/>
+          <w:rFonts w:ascii="標楷體" w:eastAsia="標楷體" w:hAnsi="標楷體" w:hint="eastAsia"/>
         </w:rPr>
       </w:pPr>
       <w:r>
@@ -673,190 +192,6 @@
         </w:rPr>
         <w:t>相關參考</w:t>
       </w:r>
-    </w:p>
-    <w:p>
-      <w:pPr>
-        <w:pStyle w:val="a9"/>
-        <w:numPr>
-          <w:ilvl w:val="0"/>
-          <w:numId w:val="3"/>
-        </w:numPr>
-        <w:rPr>
-          <w:rFonts w:ascii="Times New Roman" w:eastAsia="標楷體" w:hAnsi="Times New Roman" w:cs="Times New Roman"/>
-        </w:rPr>
-      </w:pPr>
-      <w:r>
-        <w:rPr>
-          <w:rFonts w:ascii="Times New Roman" w:eastAsia="標楷體" w:hAnsi="Times New Roman" w:cs="Times New Roman" w:hint="eastAsia"/>
-        </w:rPr>
-        <w:t xml:space="preserve">[1] </w:t>
-      </w:r>
-      <w:hyperlink r:id="rId7" w:history="1">
-        <w:r>
-          <w:rPr>
-            <w:rStyle w:val="ae"/>
-            <w:rFonts w:ascii="Times New Roman" w:eastAsia="標楷體" w:hAnsi="Times New Roman" w:cs="Times New Roman"/>
-          </w:rPr>
-          <w:t>MSP430G2553 LaunchPad™ Development Kit</w:t>
-        </w:r>
-      </w:hyperlink>
-    </w:p>
-    <w:p>
-      <w:pPr>
-        <w:pStyle w:val="a9"/>
-        <w:numPr>
-          <w:ilvl w:val="0"/>
-          <w:numId w:val="3"/>
-        </w:numPr>
-        <w:rPr>
-          <w:rFonts w:ascii="Times New Roman" w:eastAsia="標楷體" w:hAnsi="Times New Roman" w:cs="Times New Roman"/>
-        </w:rPr>
-      </w:pPr>
-      <w:r>
-        <w:rPr>
-          <w:rFonts w:ascii="Times New Roman" w:eastAsia="標楷體" w:hAnsi="Times New Roman" w:cs="Times New Roman" w:hint="eastAsia"/>
-        </w:rPr>
-        <w:t xml:space="preserve">[2] </w:t>
-      </w:r>
-      <w:hyperlink r:id="rId8" w:history="1">
-        <w:r>
-          <w:rPr>
-            <w:rStyle w:val="ae"/>
-            <w:rFonts w:ascii="Times New Roman" w:eastAsia="標楷體" w:hAnsi="Times New Roman" w:cs="Times New Roman"/>
-          </w:rPr>
-          <w:t>Energia Tutorial</w:t>
-        </w:r>
-      </w:hyperlink>
-    </w:p>
-    <w:p>
-      <w:pPr>
-        <w:pStyle w:val="a9"/>
-        <w:numPr>
-          <w:ilvl w:val="0"/>
-          <w:numId w:val="3"/>
-        </w:numPr>
-        <w:rPr>
-          <w:rFonts w:ascii="Times New Roman" w:eastAsia="標楷體" w:hAnsi="Times New Roman" w:cs="Times New Roman"/>
-        </w:rPr>
-      </w:pPr>
-      <w:r>
-        <w:rPr>
-          <w:rFonts w:ascii="Times New Roman" w:eastAsia="標楷體" w:hAnsi="Times New Roman" w:cs="Times New Roman" w:hint="eastAsia"/>
-        </w:rPr>
-        <w:t xml:space="preserve">[3] </w:t>
-      </w:r>
-      <w:hyperlink r:id="rId9" w:history="1">
-        <w:r>
-          <w:rPr>
-            <w:rStyle w:val="ae"/>
-            <w:rFonts w:ascii="Times New Roman" w:eastAsia="標楷體" w:hAnsi="Times New Roman" w:cs="Times New Roman"/>
-          </w:rPr>
-          <w:t>energia.nu/guide/libraries/serial/</w:t>
-        </w:r>
-      </w:hyperlink>
-    </w:p>
-    <w:p>
-      <w:pPr>
-        <w:pStyle w:val="a9"/>
-        <w:numPr>
-          <w:ilvl w:val="0"/>
-          <w:numId w:val="3"/>
-        </w:numPr>
-        <w:rPr>
-          <w:rFonts w:ascii="Times New Roman" w:eastAsia="標楷體" w:hAnsi="Times New Roman" w:cs="Times New Roman"/>
-        </w:rPr>
-      </w:pPr>
-      <w:r>
-        <w:rPr>
-          <w:rFonts w:ascii="Times New Roman" w:eastAsia="標楷體" w:hAnsi="Times New Roman" w:cs="Times New Roman" w:hint="eastAsia"/>
-        </w:rPr>
-        <w:t xml:space="preserve">[4] </w:t>
-      </w:r>
-      <w:hyperlink r:id="rId10" w:history="1">
-        <w:r>
-          <w:rPr>
-            <w:rStyle w:val="ae"/>
-            <w:rFonts w:ascii="Times New Roman" w:eastAsia="標楷體" w:hAnsi="Times New Roman" w:cs="Times New Roman"/>
-          </w:rPr>
-          <w:t>energia.nu/pinmaps/msp-exp430g2/</w:t>
-        </w:r>
-      </w:hyperlink>
-    </w:p>
-    <w:p>
-      <w:pPr>
-        <w:pStyle w:val="a9"/>
-        <w:numPr>
-          <w:ilvl w:val="0"/>
-          <w:numId w:val="3"/>
-        </w:numPr>
-        <w:rPr>
-          <w:rFonts w:ascii="Times New Roman" w:eastAsia="標楷體" w:hAnsi="Times New Roman" w:cs="Times New Roman"/>
-        </w:rPr>
-      </w:pPr>
-      <w:r>
-        <w:rPr>
-          <w:rFonts w:ascii="Times New Roman" w:eastAsia="標楷體" w:hAnsi="Times New Roman" w:cs="Times New Roman" w:hint="eastAsia"/>
-        </w:rPr>
-        <w:t>[</w:t>
-      </w:r>
-      <w:r>
-        <w:rPr>
-          <w:rFonts w:ascii="Times New Roman" w:eastAsia="標楷體" w:hAnsi="Times New Roman" w:cs="Times New Roman" w:hint="eastAsia"/>
-        </w:rPr>
-        <w:t>5</w:t>
-      </w:r>
-      <w:r>
-        <w:rPr>
-          <w:rFonts w:ascii="Times New Roman" w:eastAsia="標楷體" w:hAnsi="Times New Roman" w:cs="Times New Roman" w:hint="eastAsia"/>
-        </w:rPr>
-        <w:t xml:space="preserve">] </w:t>
-      </w:r>
-      <w:hyperlink r:id="rId11" w:history="1">
-        <w:r>
-          <w:rPr>
-            <w:rStyle w:val="ae"/>
-            <w:rFonts w:ascii="Times New Roman" w:eastAsia="標楷體" w:hAnsi="Times New Roman" w:cs="Times New Roman"/>
-          </w:rPr>
-          <w:t>platformIO-timsp430</w:t>
-        </w:r>
-      </w:hyperlink>
-    </w:p>
-    <w:p>
-      <w:pPr>
-        <w:pStyle w:val="a9"/>
-        <w:numPr>
-          <w:ilvl w:val="0"/>
-          <w:numId w:val="3"/>
-        </w:numPr>
-        <w:rPr>
-          <w:rFonts w:ascii="Times New Roman" w:eastAsia="標楷體" w:hAnsi="Times New Roman" w:cs="Times New Roman" w:hint="eastAsia"/>
-          <w:lang w:val="fr-FR"/>
-        </w:rPr>
-      </w:pPr>
-      <w:r>
-        <w:rPr>
-          <w:rFonts w:ascii="Times New Roman" w:eastAsia="標楷體" w:hAnsi="Times New Roman" w:cs="Times New Roman" w:hint="eastAsia"/>
-          <w:lang w:val="fr-FR"/>
-        </w:rPr>
-        <w:t>[</w:t>
-      </w:r>
-      <w:r>
-        <w:rPr>
-          <w:rFonts w:ascii="Times New Roman" w:eastAsia="標楷體" w:hAnsi="Times New Roman" w:cs="Times New Roman" w:hint="eastAsia"/>
-          <w:lang w:val="fr-FR"/>
-        </w:rPr>
-        <w:t xml:space="preserve">6] </w:t>
-      </w:r>
-      <w:hyperlink r:id="rId12" w:history="1">
-        <w:r>
-          <w:rPr>
-            <w:rStyle w:val="ae"/>
-            <w:rFonts w:ascii="Times New Roman" w:eastAsia="標楷體" w:hAnsi="Times New Roman" w:cs="Times New Roman"/>
-            <w:lang w:val="fr-FR"/>
-          </w:rPr>
-          <w:t>pio device monitor — PlatformIO v6.1 documentation</w:t>
-        </w:r>
-      </w:hyperlink>
     </w:p>
     <w:sectPr>
       <w:pgSz w:w="11906" w:h="16838"/>
@@ -1778,6 +1113,7 @@
   <w:style w:type="character" w:default="1" w:styleId="a0">
     <w:name w:val="Default Paragraph Font"/>
     <w:uiPriority w:val="1"/>
+    <w:semiHidden/>
     <w:unhideWhenUsed/>
   </w:style>
   <w:style w:type="table" w:default="1" w:styleId="a1">

</xml_diff>

<commit_message>
vault backup: 2025-03-27 12:55:01
</commit_message>
<xml_diff>
--- a/Lec HW/MSP430_class1.docx
+++ b/Lec HW/MSP430_class1.docx
@@ -19,7 +19,7 @@
         <w:rPr>
           <w:rFonts w:ascii="Times New Roman" w:eastAsia="標楷體" w:hAnsi="Times New Roman" w:cs="Times New Roman" w:hint="eastAsia"/>
         </w:rPr>
-        <w:t>3</w:t>
+        <w:t>3.5</w:t>
       </w:r>
     </w:p>
     <w:p>
@@ -44,7 +44,7 @@
           <w:numId w:val="1"/>
         </w:numPr>
         <w:rPr>
-          <w:rFonts w:ascii="Times New Roman" w:eastAsia="標楷體" w:hAnsi="Times New Roman" w:cs="Times New Roman" w:hint="eastAsia"/>
+          <w:rFonts w:ascii="Times New Roman" w:eastAsia="標楷體" w:hAnsi="Times New Roman" w:cs="Times New Roman"/>
         </w:rPr>
       </w:pPr>
       <w:r>
@@ -183,7 +183,7 @@
       <w:pPr>
         <w:pStyle w:val="a3"/>
         <w:rPr>
-          <w:rFonts w:ascii="標楷體" w:eastAsia="標楷體" w:hAnsi="標楷體" w:hint="eastAsia"/>
+          <w:rFonts w:ascii="標楷體" w:eastAsia="標楷體" w:hAnsi="標楷體"/>
         </w:rPr>
       </w:pPr>
       <w:r>
@@ -201,6 +201,56 @@
     </w:sectPr>
   </w:body>
 </w:document>
+</file>
+
+<file path=word/endnotes.xml><?xml version="1.0" encoding="utf-8"?>
+<w:endnotes xmlns:wpc="http://schemas.microsoft.com/office/word/2010/wordprocessingCanvas" xmlns:cx="http://schemas.microsoft.com/office/drawing/2014/chartex" xmlns:cx1="http://schemas.microsoft.com/office/drawing/2015/9/8/chartex" xmlns:cx2="http://schemas.microsoft.com/office/drawing/2015/10/21/chartex" xmlns:cx3="http://schemas.microsoft.com/office/drawing/2016/5/9/chartex" xmlns:cx4="http://schemas.microsoft.com/office/drawing/2016/5/10/chartex" xmlns:cx5="http://schemas.microsoft.com/office/drawing/2016/5/11/chartex" xmlns:cx6="http://schemas.microsoft.com/office/drawing/2016/5/12/chartex" xmlns:cx7="http://schemas.microsoft.com/office/drawing/2016/5/13/chartex" xmlns:cx8="http://schemas.microsoft.com/office/drawing/2016/5/14/chartex" xmlns:mc="http://schemas.openxmlformats.org/markup-compatibility/2006" xmlns:aink="http://schemas.microsoft.com/office/drawing/2016/ink" xmlns:am3d="http://schemas.microsoft.com/office/drawing/2017/model3d" xmlns:o="urn:schemas-microsoft-com:office:office" xmlns:oel="http://schemas.microsoft.com/office/2019/extlst" xmlns:r="http://schemas.openxmlformats.org/officeDocument/2006/relationships" xmlns:m="http://schemas.openxmlformats.org/officeDocument/2006/math" xmlns:v="urn:schemas-microsoft-com:vml" xmlns:wp14="http://schemas.microsoft.com/office/word/2010/wordprocessingDrawing" xmlns:wp="http://schemas.openxmlformats.org/drawingml/2006/wordprocessingDrawing" xmlns:w10="urn:schemas-microsoft-com:office:word" xmlns:w="http://schemas.openxmlformats.org/wordprocessingml/2006/main" xmlns:w14="http://schemas.microsoft.com/office/word/2010/wordml" xmlns:w15="http://schemas.microsoft.com/office/word/2012/wordml" xmlns:w16cex="http://schemas.microsoft.com/office/word/2018/wordml/cex" xmlns:w16cid="http://schemas.microsoft.com/office/word/2016/wordml/cid" xmlns:w16="http://schemas.microsoft.com/office/word/2018/wordml" xmlns:w16du="http://schemas.microsoft.com/office/word/2023/wordml/word16du" xmlns:w16sdtdh="http://schemas.microsoft.com/office/word/2020/wordml/sdtdatahash" xmlns:w16sdtfl="http://schemas.microsoft.com/office/word/2024/wordml/sdtformatlock" xmlns:w16se="http://schemas.microsoft.com/office/word/2015/wordml/symex" xmlns:wpg="http://schemas.microsoft.com/office/word/2010/wordprocessingGroup" xmlns:wpi="http://schemas.microsoft.com/office/word/2010/wordprocessingInk" xmlns:wne="http://schemas.microsoft.com/office/word/2006/wordml" xmlns:wps="http://schemas.microsoft.com/office/word/2010/wordprocessingShape" mc:Ignorable="w14 w15 w16se w16cid w16 w16cex w16sdtdh w16sdtfl w16du wp14">
+  <w:endnote w:type="separator" w:id="-1">
+    <w:p>
+      <w:pPr>
+        <w:spacing w:after="0" w:line="240" w:lineRule="auto"/>
+      </w:pPr>
+      <w:r>
+        <w:separator/>
+      </w:r>
+    </w:p>
+  </w:endnote>
+  <w:endnote w:type="continuationSeparator" w:id="0">
+    <w:p>
+      <w:pPr>
+        <w:spacing w:after="0" w:line="240" w:lineRule="auto"/>
+      </w:pPr>
+      <w:r>
+        <w:continuationSeparator/>
+      </w:r>
+    </w:p>
+  </w:endnote>
+</w:endnotes>
+</file>
+
+<file path=word/footnotes.xml><?xml version="1.0" encoding="utf-8"?>
+<w:footnotes xmlns:wpc="http://schemas.microsoft.com/office/word/2010/wordprocessingCanvas" xmlns:cx="http://schemas.microsoft.com/office/drawing/2014/chartex" xmlns:cx1="http://schemas.microsoft.com/office/drawing/2015/9/8/chartex" xmlns:cx2="http://schemas.microsoft.com/office/drawing/2015/10/21/chartex" xmlns:cx3="http://schemas.microsoft.com/office/drawing/2016/5/9/chartex" xmlns:cx4="http://schemas.microsoft.com/office/drawing/2016/5/10/chartex" xmlns:cx5="http://schemas.microsoft.com/office/drawing/2016/5/11/chartex" xmlns:cx6="http://schemas.microsoft.com/office/drawing/2016/5/12/chartex" xmlns:cx7="http://schemas.microsoft.com/office/drawing/2016/5/13/chartex" xmlns:cx8="http://schemas.microsoft.com/office/drawing/2016/5/14/chartex" xmlns:mc="http://schemas.openxmlformats.org/markup-compatibility/2006" xmlns:aink="http://schemas.microsoft.com/office/drawing/2016/ink" xmlns:am3d="http://schemas.microsoft.com/office/drawing/2017/model3d" xmlns:o="urn:schemas-microsoft-com:office:office" xmlns:oel="http://schemas.microsoft.com/office/2019/extlst" xmlns:r="http://schemas.openxmlformats.org/officeDocument/2006/relationships" xmlns:m="http://schemas.openxmlformats.org/officeDocument/2006/math" xmlns:v="urn:schemas-microsoft-com:vml" xmlns:wp14="http://schemas.microsoft.com/office/word/2010/wordprocessingDrawing" xmlns:wp="http://schemas.openxmlformats.org/drawingml/2006/wordprocessingDrawing" xmlns:w10="urn:schemas-microsoft-com:office:word" xmlns:w="http://schemas.openxmlformats.org/wordprocessingml/2006/main" xmlns:w14="http://schemas.microsoft.com/office/word/2010/wordml" xmlns:w15="http://schemas.microsoft.com/office/word/2012/wordml" xmlns:w16cex="http://schemas.microsoft.com/office/word/2018/wordml/cex" xmlns:w16cid="http://schemas.microsoft.com/office/word/2016/wordml/cid" xmlns:w16="http://schemas.microsoft.com/office/word/2018/wordml" xmlns:w16du="http://schemas.microsoft.com/office/word/2023/wordml/word16du" xmlns:w16sdtdh="http://schemas.microsoft.com/office/word/2020/wordml/sdtdatahash" xmlns:w16sdtfl="http://schemas.microsoft.com/office/word/2024/wordml/sdtformatlock" xmlns:w16se="http://schemas.microsoft.com/office/word/2015/wordml/symex" xmlns:wpg="http://schemas.microsoft.com/office/word/2010/wordprocessingGroup" xmlns:wpi="http://schemas.microsoft.com/office/word/2010/wordprocessingInk" xmlns:wne="http://schemas.microsoft.com/office/word/2006/wordml" xmlns:wps="http://schemas.microsoft.com/office/word/2010/wordprocessingShape" mc:Ignorable="w14 w15 w16se w16cid w16 w16cex w16sdtdh w16sdtfl w16du wp14">
+  <w:footnote w:type="separator" w:id="-1">
+    <w:p>
+      <w:pPr>
+        <w:spacing w:after="0" w:line="240" w:lineRule="auto"/>
+      </w:pPr>
+      <w:r>
+        <w:separator/>
+      </w:r>
+    </w:p>
+  </w:footnote>
+  <w:footnote w:type="continuationSeparator" w:id="0">
+    <w:p>
+      <w:pPr>
+        <w:spacing w:after="0" w:line="240" w:lineRule="auto"/>
+      </w:pPr>
+      <w:r>
+        <w:continuationSeparator/>
+      </w:r>
+    </w:p>
+  </w:footnote>
+</w:footnotes>
 </file>
 
 <file path=word/numbering.xml><?xml version="1.0" encoding="utf-8"?>
@@ -1460,6 +1510,66 @@
       <w:u w:val="single"/>
     </w:rPr>
   </w:style>
+  <w:style w:type="paragraph" w:styleId="af1">
+    <w:name w:val="header"/>
+    <w:basedOn w:val="a"/>
+    <w:link w:val="af2"/>
+    <w:uiPriority w:val="99"/>
+    <w:unhideWhenUsed/>
+    <w:rsid w:val="0055182B"/>
+    <w:pPr>
+      <w:tabs>
+        <w:tab w:val="center" w:pos="4153"/>
+        <w:tab w:val="right" w:pos="8306"/>
+      </w:tabs>
+      <w:snapToGrid w:val="0"/>
+    </w:pPr>
+    <w:rPr>
+      <w:sz w:val="20"/>
+      <w:szCs w:val="20"/>
+    </w:rPr>
+  </w:style>
+  <w:style w:type="character" w:customStyle="1" w:styleId="af2">
+    <w:name w:val="頁首 字元"/>
+    <w:basedOn w:val="a0"/>
+    <w:link w:val="af1"/>
+    <w:uiPriority w:val="99"/>
+    <w:rsid w:val="0055182B"/>
+    <w:rPr>
+      <w:sz w:val="20"/>
+      <w:szCs w:val="20"/>
+    </w:rPr>
+  </w:style>
+  <w:style w:type="paragraph" w:styleId="af3">
+    <w:name w:val="footer"/>
+    <w:basedOn w:val="a"/>
+    <w:link w:val="af4"/>
+    <w:uiPriority w:val="99"/>
+    <w:unhideWhenUsed/>
+    <w:rsid w:val="0055182B"/>
+    <w:pPr>
+      <w:tabs>
+        <w:tab w:val="center" w:pos="4153"/>
+        <w:tab w:val="right" w:pos="8306"/>
+      </w:tabs>
+      <w:snapToGrid w:val="0"/>
+    </w:pPr>
+    <w:rPr>
+      <w:sz w:val="20"/>
+      <w:szCs w:val="20"/>
+    </w:rPr>
+  </w:style>
+  <w:style w:type="character" w:customStyle="1" w:styleId="af4">
+    <w:name w:val="頁尾 字元"/>
+    <w:basedOn w:val="a0"/>
+    <w:link w:val="af3"/>
+    <w:uiPriority w:val="99"/>
+    <w:rsid w:val="0055182B"/>
+    <w:rPr>
+      <w:sz w:val="20"/>
+      <w:szCs w:val="20"/>
+    </w:rPr>
+  </w:style>
 </w:styles>
 </file>
 

</xml_diff>

<commit_message>
vault backup: 2025-03-27 12:56:01
</commit_message>
<xml_diff>
--- a/Lec HW/MSP430_class1.docx
+++ b/Lec HW/MSP430_class1.docx
@@ -49,15 +49,9 @@
       </w:pPr>
       <w:r>
         <w:rPr>
-          <w:rFonts w:ascii="Times New Roman" w:eastAsia="標楷體" w:hAnsi="Times New Roman" w:cs="Times New Roman"/>
-        </w:rPr>
-        <w:t>Pinout</w:t>
-      </w:r>
-      <w:r>
-        <w:rPr>
-          <w:rFonts w:ascii="Times New Roman" w:eastAsia="標楷體" w:hAnsi="Times New Roman" w:cs="Times New Roman"/>
-        </w:rPr>
-        <w:t>接線</w:t>
+          <w:rFonts w:ascii="Times New Roman" w:eastAsia="標楷體" w:hAnsi="Times New Roman" w:cs="Times New Roman" w:hint="eastAsia"/>
+        </w:rPr>
+        <w:t>該資料夾中各個檔案的關係圖</w:t>
       </w:r>
     </w:p>
     <w:p>
@@ -73,15 +67,21 @@
       </w:pPr>
       <w:r>
         <w:rPr>
-          <w:rFonts w:ascii="Times New Roman" w:eastAsia="標楷體" w:hAnsi="Times New Roman" w:cs="Times New Roman"/>
-        </w:rPr>
-        <w:t>新的</w:t>
-      </w:r>
-      <w:r>
-        <w:rPr>
-          <w:rFonts w:ascii="Times New Roman" w:eastAsia="標楷體" w:hAnsi="Times New Roman" w:cs="Times New Roman"/>
-        </w:rPr>
-        <w:t>Block diagram</w:t>
+          <w:rFonts w:ascii="Times New Roman" w:eastAsia="標楷體" w:hAnsi="Times New Roman" w:cs="Times New Roman" w:hint="eastAsia"/>
+        </w:rPr>
+        <w:t>實測</w:t>
+      </w:r>
+      <w:r>
+        <w:rPr>
+          <w:rFonts w:ascii="Times New Roman" w:eastAsia="標楷體" w:hAnsi="Times New Roman" w:cs="Times New Roman" w:hint="eastAsia"/>
+        </w:rPr>
+        <w:t>python, C++, SWIG</w:t>
+      </w:r>
+      <w:r>
+        <w:rPr>
+          <w:rFonts w:ascii="Times New Roman" w:eastAsia="標楷體" w:hAnsi="Times New Roman" w:cs="Times New Roman" w:hint="eastAsia"/>
+        </w:rPr>
+        <w:t>版本的計算運行速度</w:t>
       </w:r>
     </w:p>
     <w:p>

</xml_diff>

<commit_message>
vault backup: 2025-03-27 12:57:01
</commit_message>
<xml_diff>
--- a/Lec HW/MSP430_class1.docx
+++ b/Lec HW/MSP430_class1.docx
@@ -83,6 +83,12 @@
         </w:rPr>
         <w:t>版本的計算運行速度</w:t>
       </w:r>
+      <w:r>
+        <w:rPr>
+          <w:rFonts w:ascii="Times New Roman" w:eastAsia="標楷體" w:hAnsi="Times New Roman" w:cs="Times New Roman" w:hint="eastAsia"/>
+        </w:rPr>
+        <w:t>，並討論為什麼會產生這樣的差異</w:t>
+      </w:r>
     </w:p>
     <w:p>
       <w:pPr>
@@ -92,38 +98,50 @@
           <w:numId w:val="1"/>
         </w:numPr>
         <w:rPr>
-          <w:rFonts w:ascii="Times New Roman" w:eastAsia="標楷體" w:hAnsi="Times New Roman" w:cs="Times New Roman"/>
-        </w:rPr>
-      </w:pPr>
-      <w:r>
-        <w:rPr>
-          <w:rFonts w:ascii="Times New Roman" w:eastAsia="標楷體" w:hAnsi="Times New Roman" w:cs="Times New Roman"/>
-        </w:rPr>
-        <w:t>將遇到的</w:t>
-      </w:r>
-      <w:r>
-        <w:rPr>
-          <w:rFonts w:ascii="Times New Roman" w:eastAsia="標楷體" w:hAnsi="Times New Roman" w:cs="Times New Roman"/>
-        </w:rPr>
-        <w:t>Bug</w:t>
-      </w:r>
-      <w:r>
-        <w:rPr>
-          <w:rFonts w:ascii="Times New Roman" w:eastAsia="標楷體" w:hAnsi="Times New Roman" w:cs="Times New Roman"/>
-        </w:rPr>
-        <w:t>註記到</w:t>
-      </w:r>
-      <w:r>
-        <w:rPr>
-          <w:rFonts w:ascii="Times New Roman" w:eastAsia="標楷體" w:hAnsi="Times New Roman" w:cs="Times New Roman"/>
-        </w:rPr>
-        <w:t>Block diagram</w:t>
-      </w:r>
-      <w:r>
-        <w:rPr>
-          <w:rFonts w:ascii="Times New Roman" w:eastAsia="標楷體" w:hAnsi="Times New Roman" w:cs="Times New Roman"/>
-        </w:rPr>
-        <w:t>上</w:t>
+          <w:rFonts w:ascii="Times New Roman" w:eastAsia="標楷體" w:hAnsi="Times New Roman" w:cs="Times New Roman" w:hint="eastAsia"/>
+        </w:rPr>
+      </w:pPr>
+      <w:r>
+        <w:rPr>
+          <w:rFonts w:ascii="Times New Roman" w:eastAsia="標楷體" w:hAnsi="Times New Roman" w:cs="Times New Roman" w:hint="eastAsia"/>
+        </w:rPr>
+        <w:t>嘗試把</w:t>
+      </w:r>
+      <w:r>
+        <w:rPr>
+          <w:rFonts w:ascii="Times New Roman" w:eastAsia="標楷體" w:hAnsi="Times New Roman" w:cs="Times New Roman" w:hint="eastAsia"/>
+        </w:rPr>
+        <w:t>%include "stdint.i"</w:t>
+      </w:r>
+      <w:r>
+        <w:rPr>
+          <w:rFonts w:ascii="Times New Roman" w:eastAsia="標楷體" w:hAnsi="Times New Roman" w:cs="Times New Roman" w:hint="eastAsia"/>
+        </w:rPr>
+        <w:t>刪除並看看會發生什麼</w:t>
+      </w:r>
+      <w:r>
+        <w:rPr>
+          <w:rFonts w:ascii="Times New Roman" w:eastAsia="標楷體" w:hAnsi="Times New Roman" w:cs="Times New Roman" w:hint="eastAsia"/>
+        </w:rPr>
+        <w:t>?</w:t>
+      </w:r>
+      <w:r>
+        <w:rPr>
+          <w:rFonts w:ascii="Times New Roman" w:eastAsia="標楷體" w:hAnsi="Times New Roman" w:cs="Times New Roman" w:hint="eastAsia"/>
+        </w:rPr>
+        <w:t>並說明遇到的</w:t>
+      </w:r>
+      <w:r>
+        <w:rPr>
+          <w:rFonts w:ascii="Times New Roman" w:eastAsia="標楷體" w:hAnsi="Times New Roman" w:cs="Times New Roman" w:hint="eastAsia"/>
+        </w:rPr>
+        <w:t>bug</w:t>
+      </w:r>
+      <w:r>
+        <w:rPr>
+          <w:rFonts w:ascii="Times New Roman" w:eastAsia="標楷體" w:hAnsi="Times New Roman" w:cs="Times New Roman" w:hint="eastAsia"/>
+        </w:rPr>
+        <w:t>原因</w:t>
       </w:r>
     </w:p>
     <w:p>

</xml_diff>

<commit_message>
vault backup: 2025-03-27 12:57:31
</commit_message>
<xml_diff>
--- a/Lec HW/MSP430_class1.docx
+++ b/Lec HW/MSP430_class1.docx
@@ -159,21 +159,26 @@
         <w:rPr>
           <w:rFonts w:ascii="Times New Roman" w:eastAsia="標楷體" w:hAnsi="Times New Roman" w:cs="Times New Roman" w:hint="eastAsia"/>
         </w:rPr>
-        <w:t>附上講義表格</w:t>
+        <w:t>嘗試把</w:t>
       </w:r>
       <w:r>
         <w:rPr>
           <w:rFonts w:ascii="Times New Roman" w:eastAsia="標楷體" w:hAnsi="Times New Roman" w:cs="Times New Roman" w:hint="eastAsia"/>
         </w:rPr>
-        <w:t>1~3</w:t>
-      </w:r>
-    </w:p>
-    <w:p>
-      <w:pPr>
-        <w:rPr>
-          <w:rFonts w:ascii="Times New Roman" w:eastAsia="標楷體" w:hAnsi="Times New Roman" w:cs="Times New Roman"/>
-        </w:rPr>
-      </w:pPr>
+        <w:t>API</w:t>
+      </w:r>
+      <w:r>
+        <w:rPr>
+          <w:rFonts w:ascii="Times New Roman" w:eastAsia="標楷體" w:hAnsi="Times New Roman" w:cs="Times New Roman" w:hint="eastAsia"/>
+        </w:rPr>
+        <w:t>庫改名，並提供新的</w:t>
+      </w:r>
+      <w:r>
+        <w:rPr>
+          <w:rFonts w:ascii="Times New Roman" w:eastAsia="標楷體" w:hAnsi="Times New Roman" w:cs="Times New Roman" w:hint="eastAsia"/>
+        </w:rPr>
+        <w:t>swig_main.py</w:t>
+      </w:r>
     </w:p>
     <w:p>
       <w:pPr>

</xml_diff>

<commit_message>
vault backup: 2025-03-27 12:58:31
</commit_message>
<xml_diff>
--- a/Lec HW/MSP430_class1.docx
+++ b/Lec HW/MSP430_class1.docx
@@ -178,6 +178,36 @@
           <w:rFonts w:ascii="Times New Roman" w:eastAsia="標楷體" w:hAnsi="Times New Roman" w:cs="Times New Roman" w:hint="eastAsia"/>
         </w:rPr>
         <w:t>swig_main.py</w:t>
+      </w:r>
+      <w:r>
+        <w:rPr>
+          <w:rFonts w:ascii="Times New Roman" w:eastAsia="標楷體" w:hAnsi="Times New Roman" w:cs="Times New Roman" w:hint="eastAsia"/>
+        </w:rPr>
+        <w:t>以及相關檔案</w:t>
+      </w:r>
+      <w:r>
+        <w:rPr>
+          <w:rFonts w:ascii="Times New Roman" w:eastAsia="標楷體" w:hAnsi="Times New Roman" w:cs="Times New Roman"/>
+        </w:rPr>
+        <w:t xml:space="preserve"> </w:t>
+      </w:r>
+      <w:r>
+        <w:rPr>
+          <w:rFonts w:ascii="Times New Roman" w:eastAsia="標楷體" w:hAnsi="Times New Roman" w:cs="Times New Roman" w:hint="eastAsia"/>
+        </w:rPr>
+        <w:t>（請張貼新ｐ的</w:t>
+      </w:r>
+      <w:r>
+        <w:rPr>
+          <w:rFonts w:ascii="Times New Roman" w:eastAsia="標楷體" w:hAnsi="Times New Roman" w:cs="Times New Roman" w:hint="eastAsia"/>
+        </w:rPr>
+        <w:t>code</w:t>
+      </w:r>
+      <w:r>
+        <w:rPr>
+          <w:rFonts w:ascii="Times New Roman" w:eastAsia="標楷體" w:hAnsi="Times New Roman" w:cs="Times New Roman" w:hint="eastAsia"/>
+        </w:rPr>
+        <w:t>在下方）</w:t>
       </w:r>
     </w:p>
     <w:p>

</xml_diff>

<commit_message>
vault backup: 2025-03-27 12:59:01
</commit_message>
<xml_diff>
--- a/Lec HW/MSP430_class1.docx
+++ b/Lec HW/MSP430_class1.docx
@@ -111,7 +111,21 @@
         <w:rPr>
           <w:rFonts w:ascii="Times New Roman" w:eastAsia="標楷體" w:hAnsi="Times New Roman" w:cs="Times New Roman" w:hint="eastAsia"/>
         </w:rPr>
-        <w:t>%include "stdint.i"</w:t>
+        <w:t>%include "</w:t>
+      </w:r>
+      <w:proofErr w:type="spellStart"/>
+      <w:r>
+        <w:rPr>
+          <w:rFonts w:ascii="Times New Roman" w:eastAsia="標楷體" w:hAnsi="Times New Roman" w:cs="Times New Roman" w:hint="eastAsia"/>
+        </w:rPr>
+        <w:t>stdint.i</w:t>
+      </w:r>
+      <w:proofErr w:type="spellEnd"/>
+      <w:r>
+        <w:rPr>
+          <w:rFonts w:ascii="Times New Roman" w:eastAsia="標楷體" w:hAnsi="Times New Roman" w:cs="Times New Roman" w:hint="eastAsia"/>
+        </w:rPr>
+        <w:t>"</w:t>
       </w:r>
       <w:r>
         <w:rPr>
@@ -195,7 +209,7 @@
         <w:rPr>
           <w:rFonts w:ascii="Times New Roman" w:eastAsia="標楷體" w:hAnsi="Times New Roman" w:cs="Times New Roman" w:hint="eastAsia"/>
         </w:rPr>
-        <w:t>（請張貼新ｐ的</w:t>
+        <w:t>（請張貼新的</w:t>
       </w:r>
       <w:r>
         <w:rPr>

</xml_diff>